<commit_message>
emp i First commit
</commit_message>
<xml_diff>
--- a/.idea/COMP6590_WrittenReport.docx
+++ b/.idea/COMP6590_WrittenReport.docx
@@ -1,6 +1,6 @@
 
 <file path=word/document.xml><?xml version="1.0" encoding="utf-8"?>
-<w:document xmlns:wpc="http://schemas.microsoft.com/office/word/2010/wordprocessingCanvas" xmlns:cx="http://schemas.microsoft.com/office/drawing/2014/chartex" xmlns:cx1="http://schemas.microsoft.com/office/drawing/2015/9/8/chartex" xmlns:cx2="http://schemas.microsoft.com/office/drawing/2015/10/21/chartex" xmlns:cx3="http://schemas.microsoft.com/office/drawing/2016/5/9/chartex" xmlns:cx4="http://schemas.microsoft.com/office/drawing/2016/5/10/chartex" xmlns:cx5="http://schemas.microsoft.com/office/drawing/2016/5/11/chartex" xmlns:cx6="http://schemas.microsoft.com/office/drawing/2016/5/12/chartex" xmlns:cx7="http://schemas.microsoft.com/office/drawing/2016/5/13/chartex" xmlns:cx8="http://schemas.microsoft.com/office/drawing/2016/5/14/chartex" xmlns:mc="http://schemas.openxmlformats.org/markup-compatibility/2006" xmlns:aink="http://schemas.microsoft.com/office/drawing/2016/ink" xmlns:am3d="http://schemas.microsoft.com/office/drawing/2017/model3d" xmlns:o="urn:schemas-microsoft-com:office:office" xmlns:oel="http://schemas.microsoft.com/office/2019/extlst" xmlns:r="http://schemas.openxmlformats.org/officeDocument/2006/relationships" xmlns:m="http://schemas.openxmlformats.org/officeDocument/2006/math" xmlns:v="urn:schemas-microsoft-com:vml" xmlns:wp14="http://schemas.microsoft.com/office/word/2010/wordprocessingDrawing" xmlns:wp="http://schemas.openxmlformats.org/drawingml/2006/wordprocessingDrawing" xmlns:w10="urn:schemas-microsoft-com:office:word" xmlns:w="http://schemas.openxmlformats.org/wordprocessingml/2006/main" xmlns:w14="http://schemas.microsoft.com/office/word/2010/wordml" xmlns:w15="http://schemas.microsoft.com/office/word/2012/wordml" xmlns:w16cex="http://schemas.microsoft.com/office/word/2018/wordml/cex" xmlns:w16cid="http://schemas.microsoft.com/office/word/2016/wordml/cid" xmlns:w16="http://schemas.microsoft.com/office/word/2018/wordml" xmlns:w16du="http://schemas.microsoft.com/office/word/2023/wordml/word16du" xmlns:w16sdtdh="http://schemas.microsoft.com/office/word/2020/wordml/sdtdatahash" xmlns:w16se="http://schemas.microsoft.com/office/word/2015/wordml/symex" xmlns:wpg="http://schemas.microsoft.com/office/word/2010/wordprocessingGroup" xmlns:wpi="http://schemas.microsoft.com/office/word/2010/wordprocessingInk" xmlns:wne="http://schemas.microsoft.com/office/word/2006/wordml" xmlns:wps="http://schemas.microsoft.com/office/word/2010/wordprocessingShape" mc:Ignorable="w14 w15 w16se w16cid w16 w16cex w16sdtdh wp14">
+<w:document xmlns:wpc="http://schemas.microsoft.com/office/word/2010/wordprocessingCanvas" xmlns:cx="http://schemas.microsoft.com/office/drawing/2014/chartex" xmlns:cx1="http://schemas.microsoft.com/office/drawing/2015/9/8/chartex" xmlns:cx2="http://schemas.microsoft.com/office/drawing/2015/10/21/chartex" xmlns:cx3="http://schemas.microsoft.com/office/drawing/2016/5/9/chartex" xmlns:cx4="http://schemas.microsoft.com/office/drawing/2016/5/10/chartex" xmlns:cx5="http://schemas.microsoft.com/office/drawing/2016/5/11/chartex" xmlns:cx6="http://schemas.microsoft.com/office/drawing/2016/5/12/chartex" xmlns:cx7="http://schemas.microsoft.com/office/drawing/2016/5/13/chartex" xmlns:cx8="http://schemas.microsoft.com/office/drawing/2016/5/14/chartex" xmlns:mc="http://schemas.openxmlformats.org/markup-compatibility/2006" xmlns:aink="http://schemas.microsoft.com/office/drawing/2016/ink" xmlns:am3d="http://schemas.microsoft.com/office/drawing/2017/model3d" xmlns:o="urn:schemas-microsoft-com:office:office" xmlns:oel="http://schemas.microsoft.com/office/2019/extlst" xmlns:r="http://schemas.openxmlformats.org/officeDocument/2006/relationships" xmlns:m="http://schemas.openxmlformats.org/officeDocument/2006/math" xmlns:v="urn:schemas-microsoft-com:vml" xmlns:wp14="http://schemas.microsoft.com/office/word/2010/wordprocessingDrawing" xmlns:wp="http://schemas.openxmlformats.org/drawingml/2006/wordprocessingDrawing" xmlns:w10="urn:schemas-microsoft-com:office:word" xmlns:w="http://schemas.openxmlformats.org/wordprocessingml/2006/main" xmlns:w14="http://schemas.microsoft.com/office/word/2010/wordml" xmlns:w15="http://schemas.microsoft.com/office/word/2012/wordml" xmlns:w16cex="http://schemas.microsoft.com/office/word/2018/wordml/cex" xmlns:w16cid="http://schemas.microsoft.com/office/word/2016/wordml/cid" xmlns:w16="http://schemas.microsoft.com/office/word/2018/wordml" xmlns:w16sdtdh="http://schemas.microsoft.com/office/word/2020/wordml/sdtdatahash" xmlns:w16se="http://schemas.microsoft.com/office/word/2015/wordml/symex" xmlns:wpg="http://schemas.microsoft.com/office/word/2010/wordprocessingGroup" xmlns:wpi="http://schemas.microsoft.com/office/word/2010/wordprocessingInk" xmlns:wne="http://schemas.microsoft.com/office/word/2006/wordml" xmlns:wps="http://schemas.microsoft.com/office/word/2010/wordprocessingShape" mc:Ignorable="w14 w15 w16se w16cid w16 w16cex w16sdtdh wp14">
   <w:body>
     <w:p>
       <w:pPr>
@@ -159,426 +159,404 @@
         </w:rPr>
         <w:t xml:space="preserve"> (</w:t>
       </w:r>
-      <w:proofErr w:type="spellStart"/>
       <w:r>
         <w:rPr>
           <w:sz w:val="18"/>
           <w:szCs w:val="18"/>
         </w:rPr>
-        <w:t>Jordanus</w:t>
+        <w:t>Jordanus A 2012)</w:t>
+      </w:r>
+      <w:r>
+        <w:t>. And if so, how can we measure how computationally creative a system is</w:t>
+      </w:r>
+      <w:r>
+        <w:t>?</w:t>
+      </w:r>
+      <w:r>
+        <w:t xml:space="preserve"> </w:t>
+      </w:r>
+      <w:r>
+        <w:t>Despite whether a computer system can creative,</w:t>
+      </w:r>
+      <w:r>
+        <w:t xml:space="preserve"> </w:t>
+      </w:r>
+      <w:r>
+        <w:t>t</w:t>
+      </w:r>
+      <w:r>
+        <w:t xml:space="preserve">here are </w:t>
+      </w:r>
+      <w:r>
+        <w:t>various methods that are used to evaluate how creative a system</w:t>
+      </w:r>
+      <w:r>
+        <w:t>.</w:t>
+      </w:r>
+      <w:r>
+        <w:t xml:space="preserve"> </w:t>
+      </w:r>
+      <w:r>
+        <w:t>This</w:t>
+      </w:r>
+      <w:r>
+        <w:t xml:space="preserve"> paper proposes a project and applies one of these methods to measure the creativeness of the system in the project.</w:t>
+      </w:r>
+      <w:r>
+        <w:t xml:space="preserve"> </w:t>
+      </w:r>
+    </w:p>
+    <w:p>
+      <w:pPr>
+        <w:pStyle w:val="Heading1"/>
+        <w:jc w:val="both"/>
+      </w:pPr>
+      <w:r>
+        <w:t xml:space="preserve">Introduction </w:t>
+      </w:r>
+    </w:p>
+    <w:p>
+      <w:pPr>
+        <w:jc w:val="both"/>
+      </w:pPr>
+      <w:r>
+        <w:t>This paper</w:t>
+      </w:r>
+      <w:r>
+        <w:t xml:space="preserve"> will</w:t>
+      </w:r>
+      <w:r>
+        <w:t xml:space="preserve"> begin by</w:t>
+      </w:r>
+      <w:r>
+        <w:t xml:space="preserve"> </w:t>
+      </w:r>
+      <w:r>
+        <w:t>explaining</w:t>
+      </w:r>
+      <w:r>
+        <w:t xml:space="preserve"> my project, a chatbot, </w:t>
+      </w:r>
+      <w:r>
+        <w:t xml:space="preserve">and </w:t>
+      </w:r>
+      <w:r>
+        <w:t>talking about the background on the topic</w:t>
+      </w:r>
+      <w:r>
+        <w:t xml:space="preserve"> of the chatbot</w:t>
+      </w:r>
+      <w:r>
+        <w:t xml:space="preserve">. In this case, we will talk about </w:t>
+      </w:r>
+      <w:r>
+        <w:t>deep learning</w:t>
+      </w:r>
+      <w:r>
+        <w:t xml:space="preserve"> in computer systems, mentioning the tools required to build the neural networks used in </w:t>
+      </w:r>
+      <w:r>
+        <w:t xml:space="preserve">the chatbot. The chatbot consists of </w:t>
+      </w:r>
+      <w:proofErr w:type="spellStart"/>
+      <w:r>
+        <w:t>tw</w:t>
       </w:r>
       <w:proofErr w:type="spellEnd"/>
+      <w:r>
+        <w:t xml:space="preserve"> different types of neural networks:  convolutional neural network (CNN) and Recurrent neural network (RNN)</w:t>
+      </w:r>
+      <w:r>
+        <w:t xml:space="preserve">. </w:t>
+      </w:r>
       <w:r>
         <w:rPr>
           <w:sz w:val="18"/>
           <w:szCs w:val="18"/>
         </w:rPr>
-        <w:t xml:space="preserve"> A 2012)</w:t>
-      </w:r>
-      <w:r>
-        <w:t>. And if so, how can we measure how computationally creative a system is</w:t>
-      </w:r>
-      <w:r>
-        <w:t>?</w:t>
-      </w:r>
-      <w:r>
-        <w:t xml:space="preserve"> </w:t>
-      </w:r>
-      <w:r>
-        <w:t>Despite whether a computer system can creative,</w:t>
-      </w:r>
-      <w:r>
-        <w:t xml:space="preserve"> </w:t>
-      </w:r>
-      <w:r>
-        <w:t>t</w:t>
-      </w:r>
-      <w:r>
-        <w:t xml:space="preserve">here are </w:t>
-      </w:r>
-      <w:r>
-        <w:t>various methods that are used to evaluate how creative a system</w:t>
-      </w:r>
-      <w:r>
-        <w:t>.</w:t>
-      </w:r>
-      <w:r>
-        <w:t xml:space="preserve"> </w:t>
-      </w:r>
-      <w:r>
-        <w:t>This</w:t>
-      </w:r>
-      <w:r>
-        <w:t xml:space="preserve"> paper proposes a project and applies one of these methods to measure the creativeness of the system in the project.</w:t>
-      </w:r>
-      <w:r>
-        <w:t xml:space="preserve"> </w:t>
-      </w:r>
-    </w:p>
-    <w:p>
-      <w:pPr>
-        <w:pStyle w:val="Heading1"/>
-        <w:jc w:val="both"/>
-      </w:pPr>
-      <w:r>
-        <w:t xml:space="preserve">Introduction </w:t>
-      </w:r>
-    </w:p>
-    <w:p>
-      <w:pPr>
-        <w:jc w:val="both"/>
-      </w:pPr>
-      <w:r>
-        <w:t>This paper</w:t>
-      </w:r>
-      <w:r>
-        <w:t xml:space="preserve"> will</w:t>
-      </w:r>
-      <w:r>
-        <w:t xml:space="preserve"> begin by</w:t>
-      </w:r>
-      <w:r>
-        <w:t xml:space="preserve"> </w:t>
-      </w:r>
-      <w:r>
-        <w:t>explaining</w:t>
-      </w:r>
-      <w:r>
-        <w:t xml:space="preserve"> my project, a chatbot, </w:t>
-      </w:r>
-      <w:r>
-        <w:t xml:space="preserve">and </w:t>
-      </w:r>
-      <w:r>
-        <w:t>talking about the background on the topic</w:t>
-      </w:r>
-      <w:r>
-        <w:t xml:space="preserve"> of the chatbot</w:t>
-      </w:r>
-      <w:r>
-        <w:t xml:space="preserve">. In this case, we will talk about </w:t>
-      </w:r>
-      <w:r>
-        <w:t>deep learning</w:t>
-      </w:r>
-      <w:r>
-        <w:t xml:space="preserve"> in computer systems, mentioning the tools required to build the neural networks used in </w:t>
-      </w:r>
-      <w:r>
-        <w:t xml:space="preserve">the chatbot. The chatbot consists of </w:t>
+        <w:t>(</w:t>
       </w:r>
       <w:proofErr w:type="spellStart"/>
-      <w:r>
-        <w:t>tw</w:t>
-      </w:r>
-      <w:proofErr w:type="spellEnd"/>
-      <w:r>
-        <w:t xml:space="preserve"> different types of neural networks:  </w:t>
-      </w:r>
-      <w:commentRangeStart w:id="0"/>
-      <w:r>
-        <w:t>convolutional neural network (CNN) and Recurrent neural network (RNN)</w:t>
-      </w:r>
-      <w:r>
-        <w:t xml:space="preserve">. </w:t>
-      </w:r>
       <w:r>
         <w:rPr>
           <w:sz w:val="18"/>
           <w:szCs w:val="18"/>
         </w:rPr>
-        <w:t>(</w:t>
-      </w:r>
-      <w:proofErr w:type="spellStart"/>
+        <w:t>Khosrowabadi</w:t>
+      </w:r>
+      <w:proofErr w:type="spellEnd"/>
       <w:r>
         <w:rPr>
           <w:sz w:val="18"/>
           <w:szCs w:val="18"/>
         </w:rPr>
-        <w:t>Khosrowabadi</w:t>
-      </w:r>
-      <w:proofErr w:type="spellEnd"/>
+        <w:t xml:space="preserve"> R et all 2014)</w:t>
+      </w:r>
       <w:r>
         <w:rPr>
           <w:sz w:val="18"/>
           <w:szCs w:val="18"/>
         </w:rPr>
-        <w:t xml:space="preserve"> R et all 2014)</w:t>
+        <w:t>.</w:t>
       </w:r>
       <w:r>
         <w:rPr>
           <w:sz w:val="18"/>
           <w:szCs w:val="18"/>
         </w:rPr>
-        <w:t>.</w:t>
-      </w:r>
-      <w:commentRangeEnd w:id="0"/>
-      <w:r>
-        <w:rPr>
-          <w:rStyle w:val="CommentReference"/>
-          <w:sz w:val="12"/>
-          <w:szCs w:val="12"/>
-        </w:rPr>
-        <w:commentReference w:id="0"/>
+        <w:t xml:space="preserve"> </w:t>
+      </w:r>
+    </w:p>
+    <w:p>
+      <w:pPr>
+        <w:jc w:val="both"/>
+      </w:pPr>
+      <w:r>
+        <w:t xml:space="preserve">Next, I </w:t>
+      </w:r>
+      <w:r>
+        <w:t>showcase the development of my project</w:t>
+      </w:r>
+      <w:r>
+        <w:t>,</w:t>
+      </w:r>
+      <w:r>
+        <w:t xml:space="preserve"> </w:t>
+      </w:r>
+      <w:r>
+        <w:t>explaining</w:t>
+      </w:r>
+      <w:r>
+        <w:t xml:space="preserve"> </w:t>
+      </w:r>
+      <w:r>
+        <w:t xml:space="preserve">how I designed and the results of the chatbot, elaborating on the use of </w:t>
+      </w:r>
+      <w:proofErr w:type="spellStart"/>
+      <w:r>
+        <w:t>Keras</w:t>
+      </w:r>
+      <w:proofErr w:type="spellEnd"/>
+      <w:r>
+        <w:t xml:space="preserve"> and </w:t>
+      </w:r>
+      <w:proofErr w:type="spellStart"/>
+      <w:r>
+        <w:t>Tensorflow</w:t>
+      </w:r>
+      <w:proofErr w:type="spellEnd"/>
+      <w:r>
+        <w:t xml:space="preserve"> to build the neural networks. And then how I utilised these neural networks to produce the desired output with </w:t>
+      </w:r>
+      <w:r>
+        <w:t>P</w:t>
+      </w:r>
+      <w:r>
+        <w:t>ython. Following the design for each implementation, the results will then be shown and explained.</w:t>
+      </w:r>
+    </w:p>
+    <w:p>
+      <w:pPr>
+        <w:jc w:val="both"/>
+      </w:pPr>
+      <w:r>
+        <w:t xml:space="preserve">Afterwards, I will conduct an evaluation </w:t>
+      </w:r>
+      <w:r>
+        <w:t>of</w:t>
+      </w:r>
+      <w:r>
+        <w:t xml:space="preserve"> the project</w:t>
+      </w:r>
+      <w:r>
+        <w:t xml:space="preserve"> that </w:t>
+      </w:r>
+      <w:r>
+        <w:t>will include</w:t>
+      </w:r>
+      <w:r>
+        <w:t xml:space="preserve"> a method to measure the creativity of the system. The method used is</w:t>
+      </w:r>
+      <w:r>
+        <w:t xml:space="preserve"> Colton’s creative Tripod</w:t>
+      </w:r>
+      <w:r>
+        <w:t>,</w:t>
+      </w:r>
+      <w:r>
+        <w:t xml:space="preserve"> </w:t>
+      </w:r>
+      <w:r>
+        <w:t>that will enable us to measure based on three main aspects:</w:t>
+      </w:r>
+    </w:p>
+    <w:p>
+      <w:pPr>
+        <w:ind w:left="360"/>
+        <w:jc w:val="both"/>
+      </w:pPr>
+      <w:r>
+        <w:rPr>
+          <w:b/>
+          <w:bCs/>
+        </w:rPr>
+        <w:t xml:space="preserve">Skill: </w:t>
+      </w:r>
+      <w:r>
+        <w:t>How well the system can interpret input</w:t>
+      </w:r>
+      <w:r>
+        <w:t>ted</w:t>
+      </w:r>
+      <w:r>
+        <w:t xml:space="preserve"> information and make a reasonable response will be evaluated.</w:t>
+      </w:r>
+    </w:p>
+    <w:p>
+      <w:pPr>
+        <w:ind w:left="360"/>
+        <w:jc w:val="both"/>
+      </w:pPr>
+      <w:r>
+        <w:rPr>
+          <w:b/>
+          <w:bCs/>
+        </w:rPr>
+        <w:t xml:space="preserve">Appreciation: </w:t>
+      </w:r>
+      <w:r>
+        <w:t>I will evaluate how well the chatbot can understand and take into consideration the context of the conversation when producing responses. For instance, if the user is behaving uninterested</w:t>
+      </w:r>
+      <w:r>
+        <w:t>ly</w:t>
+      </w:r>
+      <w:r>
+        <w:t xml:space="preserve">, we can evaluate how much the chatbot has acknowledged this as the situation </w:t>
+      </w:r>
+      <w:r>
+        <w:t>in</w:t>
+      </w:r>
+      <w:r>
+        <w:t xml:space="preserve"> the context. </w:t>
+      </w:r>
+    </w:p>
+    <w:p>
+      <w:pPr>
+        <w:ind w:left="360"/>
+        <w:jc w:val="both"/>
+      </w:pPr>
+      <w:r>
+        <w:rPr>
+          <w:b/>
+          <w:bCs/>
+        </w:rPr>
+        <w:t xml:space="preserve">Imagination: </w:t>
+      </w:r>
+      <w:r>
+        <w:t xml:space="preserve">I will measure how well the chatbot will have to use its creativity through neural networks to learn the training data. The chatbot will then have to use its </w:t>
+      </w:r>
+      <w:r>
+        <w:t>creativity</w:t>
+      </w:r>
+      <w:r>
+        <w:t xml:space="preserve"> in how it uses the </w:t>
+      </w:r>
+      <w:r>
+        <w:t>learnt</w:t>
+      </w:r>
+      <w:r>
+        <w:t xml:space="preserve"> dataset to engage in conversation with a user, which can also be measured.</w:t>
+      </w:r>
+    </w:p>
+    <w:p>
+      <w:pPr>
+        <w:jc w:val="both"/>
+      </w:pPr>
+      <w:r>
+        <w:t>Lastly</w:t>
+      </w:r>
+      <w:r>
+        <w:t>,</w:t>
+      </w:r>
+      <w:r>
+        <w:t xml:space="preserve"> to finish off, this paper will conclude the discoveries of this paper.</w:t>
+      </w:r>
+    </w:p>
+    <w:p>
+      <w:pPr>
+        <w:jc w:val="both"/>
+      </w:pPr>
+      <w:r>
+        <w:br w:type="page"/>
+      </w:r>
+    </w:p>
+    <w:p>
+      <w:pPr>
+        <w:pStyle w:val="Heading1"/>
+        <w:jc w:val="both"/>
+      </w:pPr>
+      <w:r>
+        <w:lastRenderedPageBreak/>
+        <w:t xml:space="preserve">Background </w:t>
+      </w:r>
+    </w:p>
+    <w:p>
+      <w:pPr>
+        <w:jc w:val="both"/>
+      </w:pPr>
+      <w:r>
+        <w:t xml:space="preserve">To create this project and explain the design of the project, which we will talk about </w:t>
+      </w:r>
+      <w:r>
+        <w:t>later</w:t>
+      </w:r>
+      <w:r>
+        <w:t xml:space="preserve"> in this paper, it is important to understand the background of</w:t>
+      </w:r>
+      <w:r>
+        <w:t xml:space="preserve"> the</w:t>
+      </w:r>
+      <w:r>
+        <w:t xml:space="preserve"> project.</w:t>
+      </w:r>
+    </w:p>
+    <w:p>
+      <w:pPr>
+        <w:jc w:val="both"/>
+      </w:pPr>
+      <w:r>
+        <w:t xml:space="preserve">Chatbots were first used in 1966, since then </w:t>
+      </w:r>
+      <w:r>
+        <w:t xml:space="preserve">they </w:t>
+      </w:r>
+      <w:r>
+        <w:t>are still being used today to perform numerous functions like providing customer support</w:t>
+      </w:r>
+      <w:r>
+        <w:t xml:space="preserve"> </w:t>
       </w:r>
       <w:r>
         <w:rPr>
           <w:sz w:val="18"/>
           <w:szCs w:val="18"/>
         </w:rPr>
-        <w:t xml:space="preserve"> </w:t>
-      </w:r>
-    </w:p>
-    <w:p>
-      <w:pPr>
-        <w:jc w:val="both"/>
-      </w:pPr>
-      <w:r>
-        <w:t xml:space="preserve">Next, I </w:t>
-      </w:r>
-      <w:r>
-        <w:t>showcase the development of my project</w:t>
-      </w:r>
-      <w:r>
-        <w:t>,</w:t>
-      </w:r>
-      <w:r>
-        <w:t xml:space="preserve"> </w:t>
-      </w:r>
-      <w:r>
-        <w:t>explaining</w:t>
-      </w:r>
-      <w:r>
-        <w:t xml:space="preserve"> </w:t>
-      </w:r>
-      <w:r>
-        <w:t xml:space="preserve">how I designed and the results of the chatbot, elaborating on the use of </w:t>
+        <w:t>(</w:t>
       </w:r>
       <w:proofErr w:type="spellStart"/>
-      <w:r>
-        <w:t>Keras</w:t>
-      </w:r>
-      <w:proofErr w:type="spellEnd"/>
-      <w:r>
-        <w:t xml:space="preserve"> and </w:t>
-      </w:r>
-      <w:proofErr w:type="spellStart"/>
-      <w:r>
-        <w:t>Tensorflow</w:t>
-      </w:r>
-      <w:proofErr w:type="spellEnd"/>
-      <w:r>
-        <w:t xml:space="preserve"> to build the neural networks. And then how I utilised these neural networks to produce the desired output with </w:t>
-      </w:r>
-      <w:r>
-        <w:t>P</w:t>
-      </w:r>
-      <w:r>
-        <w:t>ython. Following the design for each implementation, the results will then be shown and explained.</w:t>
-      </w:r>
-    </w:p>
-    <w:p>
-      <w:pPr>
-        <w:jc w:val="both"/>
-      </w:pPr>
-      <w:r>
-        <w:t xml:space="preserve">Afterwards, I will conduct an evaluation </w:t>
-      </w:r>
-      <w:r>
-        <w:t>of</w:t>
-      </w:r>
-      <w:r>
-        <w:t xml:space="preserve"> the project</w:t>
-      </w:r>
-      <w:r>
-        <w:t xml:space="preserve"> that </w:t>
-      </w:r>
-      <w:r>
-        <w:t>will include</w:t>
-      </w:r>
-      <w:r>
-        <w:t xml:space="preserve"> a method to measure the creativity of the system. The method used is</w:t>
-      </w:r>
-      <w:r>
-        <w:t xml:space="preserve"> Colton’s creative Tripod</w:t>
-      </w:r>
-      <w:r>
-        <w:t>,</w:t>
-      </w:r>
-      <w:r>
-        <w:t xml:space="preserve"> </w:t>
-      </w:r>
-      <w:r>
-        <w:t>that will enable us to measure based on three main aspects:</w:t>
-      </w:r>
-    </w:p>
-    <w:p>
-      <w:pPr>
-        <w:ind w:left="360"/>
-        <w:jc w:val="both"/>
-      </w:pPr>
-      <w:r>
-        <w:rPr>
-          <w:b/>
-          <w:bCs/>
-        </w:rPr>
-        <w:t xml:space="preserve">Skill: </w:t>
-      </w:r>
-      <w:r>
-        <w:t>How well the system can interpret input</w:t>
-      </w:r>
-      <w:r>
-        <w:t>ted</w:t>
-      </w:r>
-      <w:r>
-        <w:t xml:space="preserve"> information and make a reasonable response will be evaluated.</w:t>
-      </w:r>
-    </w:p>
-    <w:p>
-      <w:pPr>
-        <w:ind w:left="360"/>
-        <w:jc w:val="both"/>
-      </w:pPr>
-      <w:r>
-        <w:rPr>
-          <w:b/>
-          <w:bCs/>
-        </w:rPr>
-        <w:t xml:space="preserve">Appreciation: </w:t>
-      </w:r>
-      <w:r>
-        <w:t>I will evaluate how well the chatbot can understand and take into consideration the context of the conversation when producing responses. For instance, if the user is behaving uninterested</w:t>
-      </w:r>
-      <w:r>
-        <w:t>ly</w:t>
-      </w:r>
-      <w:r>
-        <w:t xml:space="preserve">, we can evaluate how much the chatbot has acknowledged this as the situation </w:t>
-      </w:r>
-      <w:r>
-        <w:t>in</w:t>
-      </w:r>
-      <w:r>
-        <w:t xml:space="preserve"> the context. </w:t>
-      </w:r>
-    </w:p>
-    <w:p>
-      <w:pPr>
-        <w:ind w:left="360"/>
-        <w:jc w:val="both"/>
-      </w:pPr>
-      <w:r>
-        <w:rPr>
-          <w:b/>
-          <w:bCs/>
-        </w:rPr>
-        <w:t xml:space="preserve">Imagination: </w:t>
-      </w:r>
-      <w:r>
-        <w:t xml:space="preserve">I will measure how well the chatbot will have to use its creativity through neural networks to learn the training data. The chatbot will then have to use its </w:t>
-      </w:r>
-      <w:r>
-        <w:t>creativity</w:t>
-      </w:r>
-      <w:r>
-        <w:t xml:space="preserve"> in how it uses the </w:t>
-      </w:r>
-      <w:r>
-        <w:t>learnt</w:t>
-      </w:r>
-      <w:r>
-        <w:t xml:space="preserve"> dataset to engage in conversation with a user, which can also be measured.</w:t>
-      </w:r>
-    </w:p>
-    <w:p>
-      <w:pPr>
-        <w:jc w:val="both"/>
-      </w:pPr>
-      <w:r>
-        <w:t>Lastly</w:t>
-      </w:r>
-      <w:r>
-        <w:t>,</w:t>
-      </w:r>
-      <w:r>
-        <w:t xml:space="preserve"> to finish off, this paper will conclude the discoveries of this paper.</w:t>
-      </w:r>
-    </w:p>
-    <w:p>
-      <w:pPr>
-        <w:jc w:val="both"/>
-      </w:pPr>
-      <w:r>
-        <w:br w:type="page"/>
-      </w:r>
-    </w:p>
-    <w:p>
-      <w:pPr>
-        <w:pStyle w:val="Heading1"/>
-        <w:jc w:val="both"/>
-      </w:pPr>
-      <w:r>
-        <w:lastRenderedPageBreak/>
-        <w:t xml:space="preserve">Background </w:t>
-      </w:r>
-    </w:p>
-    <w:p>
-      <w:pPr>
-        <w:jc w:val="both"/>
-      </w:pPr>
-      <w:r>
-        <w:t xml:space="preserve">To create this project and explain the design of the project, which we will talk about </w:t>
-      </w:r>
-      <w:r>
-        <w:t>later</w:t>
-      </w:r>
-      <w:r>
-        <w:t xml:space="preserve"> in this paper, it is important to understand the background of</w:t>
-      </w:r>
-      <w:r>
-        <w:t xml:space="preserve"> the</w:t>
-      </w:r>
-      <w:r>
-        <w:t xml:space="preserve"> project.</w:t>
-      </w:r>
-    </w:p>
-    <w:p>
-      <w:pPr>
-        <w:jc w:val="both"/>
-      </w:pPr>
-      <w:r>
-        <w:t xml:space="preserve">Chatbots were first used in 1966, since then </w:t>
-      </w:r>
-      <w:r>
-        <w:t xml:space="preserve">they </w:t>
-      </w:r>
-      <w:r>
-        <w:t>are still being used today to perform numerous functions like providing customer support</w:t>
-      </w:r>
-      <w:r>
-        <w:t xml:space="preserve"> </w:t>
-      </w:r>
       <w:r>
         <w:rPr>
           <w:sz w:val="18"/>
           <w:szCs w:val="18"/>
         </w:rPr>
-        <w:t>(</w:t>
-      </w:r>
-      <w:proofErr w:type="spellStart"/>
+        <w:t>Floatboat</w:t>
+      </w:r>
+      <w:proofErr w:type="spellEnd"/>
       <w:r>
         <w:rPr>
           <w:sz w:val="18"/>
           <w:szCs w:val="18"/>
         </w:rPr>
-        <w:t>Floatboat</w:t>
-      </w:r>
-      <w:proofErr w:type="spellEnd"/>
-      <w:r>
-        <w:rPr>
-          <w:sz w:val="18"/>
-          <w:szCs w:val="18"/>
-        </w:rPr>
         <w:t xml:space="preserve"> 2022)</w:t>
       </w:r>
       <w:r>
@@ -902,7 +880,6 @@
       <w:pPr>
         <w:jc w:val="both"/>
       </w:pPr>
-      <w:commentRangeStart w:id="1"/>
       <w:r>
         <w:rPr>
           <w:b/>
@@ -987,13 +964,6 @@
       </w:r>
       <w:r>
         <w:t xml:space="preserve"> the class. I also created the entire CNN myself to get a better performing CNN.</w:t>
-      </w:r>
-      <w:commentRangeEnd w:id="1"/>
-      <w:r>
-        <w:rPr>
-          <w:rStyle w:val="CommentReference"/>
-        </w:rPr>
-        <w:commentReference w:id="1"/>
       </w:r>
     </w:p>
     <w:p>
@@ -1201,7 +1171,7 @@
                     <pic:cNvPicPr/>
                   </pic:nvPicPr>
                   <pic:blipFill>
-                    <a:blip r:embed="rId11"/>
+                    <a:blip r:embed="rId7"/>
                     <a:stretch>
                       <a:fillRect/>
                     </a:stretch>
@@ -1247,7 +1217,7 @@
                     <pic:cNvPicPr/>
                   </pic:nvPicPr>
                   <pic:blipFill>
-                    <a:blip r:embed="rId12"/>
+                    <a:blip r:embed="rId8"/>
                     <a:stretch>
                       <a:fillRect/>
                     </a:stretch>
@@ -1368,16 +1338,7 @@
         <w:t xml:space="preserve"> above the grey text</w:t>
       </w:r>
       <w:r>
-        <w:t xml:space="preserve"> are</w:t>
-      </w:r>
-      <w:r>
-        <w:t xml:space="preserve"> the score value</w:t>
-      </w:r>
-      <w:r>
-        <w:t>s</w:t>
-      </w:r>
-      <w:r>
-        <w:t xml:space="preserve"> of each possible intent the input could be. </w:t>
+        <w:t xml:space="preserve"> are the score values of each possible intent the input could be. </w:t>
       </w:r>
       <w:r>
         <w:rPr>
@@ -1872,7 +1833,7 @@
                     <pic:cNvPicPr/>
                   </pic:nvPicPr>
                   <pic:blipFill>
-                    <a:blip r:embed="rId13"/>
+                    <a:blip r:embed="rId9"/>
                     <a:stretch>
                       <a:fillRect/>
                     </a:stretch>
@@ -2475,7 +2436,7 @@
                     <pic:cNvPicPr/>
                   </pic:nvPicPr>
                   <pic:blipFill>
-                    <a:blip r:embed="rId14"/>
+                    <a:blip r:embed="rId10"/>
                     <a:stretch>
                       <a:fillRect/>
                     </a:stretch>
@@ -2521,7 +2482,7 @@
                     <pic:cNvPicPr/>
                   </pic:nvPicPr>
                   <pic:blipFill>
-                    <a:blip r:embed="rId15"/>
+                    <a:blip r:embed="rId11"/>
                     <a:stretch>
                       <a:fillRect/>
                     </a:stretch>
@@ -2587,7 +2548,7 @@
                     <pic:cNvPicPr/>
                   </pic:nvPicPr>
                   <pic:blipFill>
-                    <a:blip r:embed="rId16">
+                    <a:blip r:embed="rId12">
                       <a:extLst>
                         <a:ext uri="{28A0092B-C50C-407E-A947-70E740481C1C}">
                           <a14:useLocalDpi xmlns:a14="http://schemas.microsoft.com/office/drawing/2010/main" val="0"/>
@@ -3021,7 +2982,7 @@
                     <pic:cNvPicPr/>
                   </pic:nvPicPr>
                   <pic:blipFill>
-                    <a:blip r:embed="rId17"/>
+                    <a:blip r:embed="rId13"/>
                     <a:stretch>
                       <a:fillRect/>
                     </a:stretch>
@@ -3091,7 +3052,7 @@
                     <pic:cNvPicPr/>
                   </pic:nvPicPr>
                   <pic:blipFill>
-                    <a:blip r:embed="rId18"/>
+                    <a:blip r:embed="rId14"/>
                     <a:stretch>
                       <a:fillRect/>
                     </a:stretch>
@@ -3630,7 +3591,7 @@
       <w:r>
         <w:t xml:space="preserve">; 2021 Sep 14, 09:20 UTC [cited 2023 May 1]. Available from: </w:t>
       </w:r>
-      <w:hyperlink r:id="rId19" w:history="1">
+      <w:hyperlink r:id="rId15" w:history="1">
         <w:r>
           <w:rPr>
             <w:rStyle w:val="Hyperlink"/>
@@ -3640,24 +3601,11 @@
       </w:hyperlink>
     </w:p>
     <w:p>
-      <w:proofErr w:type="spellStart"/>
       <w:r>
         <w:lastRenderedPageBreak/>
-        <w:t>OpenAI</w:t>
-      </w:r>
-      <w:proofErr w:type="spellEnd"/>
-      <w:r>
-        <w:t xml:space="preserve">. Chat [Internet]. San Francisco: </w:t>
-      </w:r>
-      <w:proofErr w:type="spellStart"/>
-      <w:r>
-        <w:t>OpenAI</w:t>
-      </w:r>
-      <w:proofErr w:type="spellEnd"/>
-      <w:r>
-        <w:t xml:space="preserve">; [cited 2023 May 1]. Available from: </w:t>
-      </w:r>
-      <w:hyperlink r:id="rId20" w:history="1">
+        <w:t xml:space="preserve">OpenAI. Chat [Internet]. San Francisco: OpenAI; [cited 2023 May 1]. Available from: </w:t>
+      </w:r>
+      <w:hyperlink r:id="rId16" w:history="1">
         <w:r>
           <w:rPr>
             <w:rStyle w:val="Hyperlink"/>
@@ -3678,7 +3626,7 @@
       <w:r>
         <w:t xml:space="preserve"> </w:t>
       </w:r>
-      <w:hyperlink r:id="rId21" w:history="1">
+      <w:hyperlink r:id="rId17" w:history="1">
         <w:r>
           <w:rPr>
             <w:rStyle w:val="Hyperlink"/>
@@ -3691,7 +3639,7 @@
       <w:r>
         <w:t xml:space="preserve">Surfactants Network. The role of artificial intelligence in video games [Internet]. Surfactants Network; 2021 May 4 [cited 2023 May 1]. Available from: </w:t>
       </w:r>
-      <w:hyperlink r:id="rId22" w:history="1">
+      <w:hyperlink r:id="rId18" w:history="1">
         <w:r>
           <w:rPr>
             <w:rStyle w:val="Hyperlink"/>
@@ -3710,7 +3658,7 @@
       <w:r>
         <w:t xml:space="preserve">]. Available from: </w:t>
       </w:r>
-      <w:hyperlink r:id="rId23" w:history="1">
+      <w:hyperlink r:id="rId19" w:history="1">
         <w:r>
           <w:rPr>
             <w:rStyle w:val="Hyperlink"/>
@@ -3737,7 +3685,7 @@
       <w:r>
         <w:t xml:space="preserve">]. Available from: </w:t>
       </w:r>
-      <w:hyperlink r:id="rId24" w:history="1">
+      <w:hyperlink r:id="rId20" w:history="1">
         <w:r>
           <w:rPr>
             <w:rStyle w:val="Hyperlink"/>
@@ -3750,7 +3698,7 @@
       <w:r>
         <w:t xml:space="preserve">The Game of Thrones. Transcripts: Game of Thrones [Internet]. Forever Dreaming; [cited 2023 May 4]. Available from: </w:t>
       </w:r>
-      <w:hyperlink r:id="rId25" w:history="1">
+      <w:hyperlink r:id="rId21" w:history="1">
         <w:r>
           <w:rPr>
             <w:rStyle w:val="Hyperlink"/>
@@ -3771,7 +3719,7 @@
       <w:r>
         <w:t xml:space="preserve"> [cited 2023 May 4]. Available from: </w:t>
       </w:r>
-      <w:hyperlink r:id="rId26" w:history="1">
+      <w:hyperlink r:id="rId22" w:history="1">
         <w:r>
           <w:rPr>
             <w:rStyle w:val="Hyperlink"/>
@@ -3797,7 +3745,7 @@
       <w:r>
         <w:t xml:space="preserve"> [Internet]. 2021 [cited 2023 May 6]. Available from: </w:t>
       </w:r>
-      <w:hyperlink r:id="rId27" w:history="1">
+      <w:hyperlink r:id="rId23" w:history="1">
         <w:r>
           <w:rPr>
             <w:rStyle w:val="Hyperlink"/>
@@ -3823,7 +3771,7 @@
       <w:r>
         <w:t xml:space="preserve">; [cited 2023 May 4]. Available from: </w:t>
       </w:r>
-      <w:hyperlink r:id="rId28" w:history="1">
+      <w:hyperlink r:id="rId24" w:history="1">
         <w:r>
           <w:rPr>
             <w:rStyle w:val="Hyperlink"/>
@@ -3849,7 +3797,7 @@
       <w:r>
         <w:t xml:space="preserve">; [cited 2023 May 4]. Available from: </w:t>
       </w:r>
-      <w:hyperlink r:id="rId29" w:history="1">
+      <w:hyperlink r:id="rId25" w:history="1">
         <w:r>
           <w:rPr>
             <w:rStyle w:val="Hyperlink"/>
@@ -3867,7 +3815,7 @@
       <w:r>
         <w:t xml:space="preserve">. TensorFlow 2.0 Complete Course - Python Neural Networks for Beginners Tutorial [Internet]. YouTube; 2019 Apr 9 [cited 2023 April 26]. Available from: </w:t>
       </w:r>
-      <w:hyperlink r:id="rId30" w:history="1">
+      <w:hyperlink r:id="rId26" w:history="1">
         <w:r>
           <w:rPr>
             <w:rStyle w:val="Hyperlink"/>
@@ -3885,7 +3833,7 @@
       <w:r>
         <w:t xml:space="preserve">. TensorFlow 2.0 Tutorial for Beginners - Machine Learning Basics with Python [Internet]. YouTube; 2019 Apr 29 [cited 2023 April 26]. Available from: </w:t>
       </w:r>
-      <w:hyperlink r:id="rId31" w:history="1">
+      <w:hyperlink r:id="rId27" w:history="1">
         <w:r>
           <w:rPr>
             <w:rStyle w:val="Hyperlink"/>
@@ -3898,7 +3846,7 @@
       <w:r>
         <w:t xml:space="preserve">Chewy. Learn Python and TensorFlow in a fun and practical way - Episode 1 [Internet]. YouTube; 2019 Jul 9 [cited 2023 April 26]. Available from: </w:t>
       </w:r>
-      <w:hyperlink r:id="rId32" w:history="1">
+      <w:hyperlink r:id="rId28" w:history="1">
         <w:r>
           <w:rPr>
             <w:rStyle w:val="Hyperlink"/>
@@ -3930,7 +3878,7 @@
       <w:r>
         <w:t xml:space="preserve">]. Available from: </w:t>
       </w:r>
-      <w:hyperlink r:id="rId33" w:history="1">
+      <w:hyperlink r:id="rId29" w:history="1">
         <w:r>
           <w:rPr>
             <w:rStyle w:val="Hyperlink"/>
@@ -3949,7 +3897,7 @@
       <w:r>
         <w:t xml:space="preserve">]. Available from: </w:t>
       </w:r>
-      <w:hyperlink r:id="rId34" w:history="1">
+      <w:hyperlink r:id="rId30" w:history="1">
         <w:r>
           <w:rPr>
             <w:rStyle w:val="Hyperlink"/>
@@ -3960,7 +3908,7 @@
     </w:p>
     <w:p/>
     <w:sectPr>
-      <w:headerReference w:type="default" r:id="rId35"/>
+      <w:headerReference w:type="default" r:id="rId31"/>
       <w:pgSz w:w="11906" w:h="16838"/>
       <w:pgMar w:top="1440" w:right="1440" w:bottom="1440" w:left="1440" w:header="708" w:footer="708" w:gutter="0"/>
       <w:cols w:space="708"/>
@@ -3970,202 +3918,8 @@
 </w:document>
 </file>
 
-<file path=word/comments.xml><?xml version="1.0" encoding="utf-8"?>
-<w:comments xmlns:wpc="http://schemas.microsoft.com/office/word/2010/wordprocessingCanvas" xmlns:cx="http://schemas.microsoft.com/office/drawing/2014/chartex" xmlns:cx1="http://schemas.microsoft.com/office/drawing/2015/9/8/chartex" xmlns:cx2="http://schemas.microsoft.com/office/drawing/2015/10/21/chartex" xmlns:cx3="http://schemas.microsoft.com/office/drawing/2016/5/9/chartex" xmlns:cx4="http://schemas.microsoft.com/office/drawing/2016/5/10/chartex" xmlns:cx5="http://schemas.microsoft.com/office/drawing/2016/5/11/chartex" xmlns:cx6="http://schemas.microsoft.com/office/drawing/2016/5/12/chartex" xmlns:cx7="http://schemas.microsoft.com/office/drawing/2016/5/13/chartex" xmlns:cx8="http://schemas.microsoft.com/office/drawing/2016/5/14/chartex" xmlns:mc="http://schemas.openxmlformats.org/markup-compatibility/2006" xmlns:aink="http://schemas.microsoft.com/office/drawing/2016/ink" xmlns:am3d="http://schemas.microsoft.com/office/drawing/2017/model3d" xmlns:o="urn:schemas-microsoft-com:office:office" xmlns:oel="http://schemas.microsoft.com/office/2019/extlst" xmlns:r="http://schemas.openxmlformats.org/officeDocument/2006/relationships" xmlns:m="http://schemas.openxmlformats.org/officeDocument/2006/math" xmlns:v="urn:schemas-microsoft-com:vml" xmlns:wp14="http://schemas.microsoft.com/office/word/2010/wordprocessingDrawing" xmlns:wp="http://schemas.openxmlformats.org/drawingml/2006/wordprocessingDrawing" xmlns:w10="urn:schemas-microsoft-com:office:word" xmlns:w="http://schemas.openxmlformats.org/wordprocessingml/2006/main" xmlns:w14="http://schemas.microsoft.com/office/word/2010/wordml" xmlns:w15="http://schemas.microsoft.com/office/word/2012/wordml" xmlns:w16cex="http://schemas.microsoft.com/office/word/2018/wordml/cex" xmlns:w16cid="http://schemas.microsoft.com/office/word/2016/wordml/cid" xmlns:w16="http://schemas.microsoft.com/office/word/2018/wordml" xmlns:w16du="http://schemas.microsoft.com/office/word/2023/wordml/word16du" xmlns:w16sdtdh="http://schemas.microsoft.com/office/word/2020/wordml/sdtdatahash" xmlns:w16se="http://schemas.microsoft.com/office/word/2015/wordml/symex" xmlns:wpg="http://schemas.microsoft.com/office/word/2010/wordprocessingGroup" xmlns:wpi="http://schemas.microsoft.com/office/word/2010/wordprocessingInk" xmlns:wne="http://schemas.microsoft.com/office/word/2006/wordml" xmlns:wps="http://schemas.microsoft.com/office/word/2010/wordprocessingShape" mc:Ignorable="w14 w15 w16se w16cid w16 w16cex w16sdtdh wp14">
-  <w:comment w:id="0" w:author="Interior" w:date="2023-05-02T21:35:00Z" w:initials="I">
-    <w:p>
-      <w:pPr>
-        <w:pStyle w:val="CommentText"/>
-      </w:pPr>
-      <w:r>
-        <w:rPr>
-          <w:rStyle w:val="CommentReference"/>
-        </w:rPr>
-        <w:annotationRef/>
-      </w:r>
-      <w:r>
-        <w:t>Double check if the first one is actually a CNN,</w:t>
-      </w:r>
-      <w:r>
-        <w:br/>
-      </w:r>
-      <w:r>
-        <w:br/>
-        <w:t>Second neural network is a special type of RNN, that uses LSTM Long short-term memory. Technically LSTM is a neuron and not a network., a network that uses LSTM cells is called a LSTM network.</w:t>
-      </w:r>
-    </w:p>
-    <w:p>
-      <w:pPr>
-        <w:pStyle w:val="CommentText"/>
-      </w:pPr>
-    </w:p>
-    <w:p>
-      <w:pPr>
-        <w:pStyle w:val="CommentText"/>
-        <w:ind w:left="580"/>
-      </w:pPr>
-      <w:r>
-        <w:rPr>
-          <w:color w:val="333333"/>
-        </w:rPr>
-        <w:t>o Firstly, introduced by Hochreiter &amp; Schmidhuber (1997).</w:t>
-      </w:r>
-    </w:p>
-    <w:p>
-      <w:pPr>
-        <w:pStyle w:val="CommentText"/>
-        <w:ind w:left="580"/>
-      </w:pPr>
-      <w:r>
-        <w:rPr>
-          <w:color w:val="000000"/>
-          <w:u w:val="single"/>
-        </w:rPr>
-        <w:t xml:space="preserve">o </w:t>
-      </w:r>
-      <w:r>
-        <w:rPr>
-          <w:color w:val="0462C1"/>
-          <w:u w:val="single"/>
-        </w:rPr>
-        <w:t>https://ieeexplore.ieee.org/abstract/document/6795963</w:t>
-      </w:r>
-    </w:p>
-  </w:comment>
-  <w:comment w:id="1" w:author="Interior" w:date="2023-05-05T00:51:00Z" w:initials="I">
-    <w:p>
-      <w:pPr>
-        <w:pStyle w:val="CommentText"/>
-      </w:pPr>
-      <w:r>
-        <w:rPr>
-          <w:rStyle w:val="CommentReference"/>
-        </w:rPr>
-        <w:annotationRef/>
-      </w:r>
-      <w:r>
-        <w:t>Just recording deleted information that might be useful:</w:t>
-      </w:r>
-      <w:r>
-        <w:br/>
-      </w:r>
-      <w:r>
-        <w:br/>
-      </w:r>
-      <w:r>
-        <w:rPr>
-          <w:b/>
-          <w:bCs/>
-          <w:color w:val="FF0000"/>
-        </w:rPr>
-        <w:t xml:space="preserve">Training.py: </w:t>
-      </w:r>
-      <w:r>
-        <w:rPr>
-          <w:color w:val="FF0000"/>
-        </w:rPr>
-        <w:t xml:space="preserve">This python class goes through the </w:t>
-      </w:r>
-      <w:r>
-        <w:rPr>
-          <w:b/>
-          <w:bCs/>
-          <w:color w:val="FF0000"/>
-        </w:rPr>
-        <w:t>intents.json</w:t>
-      </w:r>
-      <w:r>
-        <w:rPr>
-          <w:color w:val="FF0000"/>
-        </w:rPr>
-        <w:t xml:space="preserve"> file and stores the contents of that file into arrays. All the patterns from the </w:t>
-      </w:r>
-      <w:r>
-        <w:rPr>
-          <w:b/>
-          <w:bCs/>
-          <w:color w:val="FF0000"/>
-        </w:rPr>
-        <w:t>intents.json</w:t>
-      </w:r>
-      <w:r>
-        <w:rPr>
-          <w:color w:val="FF0000"/>
-        </w:rPr>
-        <w:t xml:space="preserve"> file are stored into the word array, the documents array store’s a tuple of all the words and its corresponding tag, and all the intents are also stored in the ‘classes array’. These files are then stored into a pickle file.</w:t>
-      </w:r>
-    </w:p>
-    <w:p>
-      <w:pPr>
-        <w:pStyle w:val="CommentText"/>
-      </w:pPr>
-      <w:r>
-        <w:rPr>
-          <w:color w:val="FF0000"/>
-        </w:rPr>
-        <w:t>After that, the data collected from the arrays is lemmatised, sorted, and converted into an interpretable numerical format for the CNN to learn.</w:t>
-      </w:r>
-    </w:p>
-    <w:p>
-      <w:pPr>
-        <w:pStyle w:val="CommentText"/>
-      </w:pPr>
-      <w:r>
-        <w:rPr>
-          <w:color w:val="FF0000"/>
-        </w:rPr>
-        <w:t xml:space="preserve"> so that we can then use these arrays to lemmatize, sort and convert the data into a readable format for the neural network.</w:t>
-      </w:r>
-    </w:p>
-    <w:p>
-      <w:pPr>
-        <w:pStyle w:val="CommentText"/>
-      </w:pPr>
-      <w:r>
-        <w:rPr>
-          <w:color w:val="FF0000"/>
-        </w:rPr>
-        <w:t>The data is</w:t>
-      </w:r>
-    </w:p>
-    <w:p>
-      <w:pPr>
-        <w:pStyle w:val="CommentText"/>
-      </w:pPr>
-      <w:r>
-        <w:rPr>
-          <w:color w:val="FF0000"/>
-        </w:rPr>
-        <w:t xml:space="preserve"> For each Also, all intent tags are also stored into the ‘classes array’. Both array</w:t>
-      </w:r>
-    </w:p>
-  </w:comment>
-</w:comments>
-</file>
-
-<file path=word/commentsExtended.xml><?xml version="1.0" encoding="utf-8"?>
-<w15:commentsEx xmlns:wpc="http://schemas.microsoft.com/office/word/2010/wordprocessingCanvas" xmlns:cx="http://schemas.microsoft.com/office/drawing/2014/chartex" xmlns:cx1="http://schemas.microsoft.com/office/drawing/2015/9/8/chartex" xmlns:cx2="http://schemas.microsoft.com/office/drawing/2015/10/21/chartex" xmlns:cx3="http://schemas.microsoft.com/office/drawing/2016/5/9/chartex" xmlns:cx4="http://schemas.microsoft.com/office/drawing/2016/5/10/chartex" xmlns:cx5="http://schemas.microsoft.com/office/drawing/2016/5/11/chartex" xmlns:cx6="http://schemas.microsoft.com/office/drawing/2016/5/12/chartex" xmlns:cx7="http://schemas.microsoft.com/office/drawing/2016/5/13/chartex" xmlns:cx8="http://schemas.microsoft.com/office/drawing/2016/5/14/chartex" xmlns:mc="http://schemas.openxmlformats.org/markup-compatibility/2006" xmlns:aink="http://schemas.microsoft.com/office/drawing/2016/ink" xmlns:am3d="http://schemas.microsoft.com/office/drawing/2017/model3d" xmlns:o="urn:schemas-microsoft-com:office:office" xmlns:oel="http://schemas.microsoft.com/office/2019/extlst" xmlns:r="http://schemas.openxmlformats.org/officeDocument/2006/relationships" xmlns:m="http://schemas.openxmlformats.org/officeDocument/2006/math" xmlns:v="urn:schemas-microsoft-com:vml" xmlns:wp14="http://schemas.microsoft.com/office/word/2010/wordprocessingDrawing" xmlns:wp="http://schemas.openxmlformats.org/drawingml/2006/wordprocessingDrawing" xmlns:w10="urn:schemas-microsoft-com:office:word" xmlns:w="http://schemas.openxmlformats.org/wordprocessingml/2006/main" xmlns:w14="http://schemas.microsoft.com/office/word/2010/wordml" xmlns:w15="http://schemas.microsoft.com/office/word/2012/wordml" xmlns:w16cex="http://schemas.microsoft.com/office/word/2018/wordml/cex" xmlns:w16cid="http://schemas.microsoft.com/office/word/2016/wordml/cid" xmlns:w16="http://schemas.microsoft.com/office/word/2018/wordml" xmlns:w16du="http://schemas.microsoft.com/office/word/2023/wordml/word16du" xmlns:w16sdtdh="http://schemas.microsoft.com/office/word/2020/wordml/sdtdatahash" xmlns:w16se="http://schemas.microsoft.com/office/word/2015/wordml/symex" xmlns:wpg="http://schemas.microsoft.com/office/word/2010/wordprocessingGroup" xmlns:wpi="http://schemas.microsoft.com/office/word/2010/wordprocessingInk" xmlns:wne="http://schemas.microsoft.com/office/word/2006/wordml" xmlns:wps="http://schemas.microsoft.com/office/word/2010/wordprocessingShape" mc:Ignorable="w14 w15 w16se w16cid w16 w16cex w16sdtdh wp14">
-  <w15:commentEx w15:paraId="08A323CA" w15:done="0"/>
-  <w15:commentEx w15:paraId="7FBC4797" w15:done="0"/>
-</w15:commentsEx>
-</file>
-
-<file path=word/commentsExtensible.xml><?xml version="1.0" encoding="utf-8"?>
-<w16cex:commentsExtensible xmlns:wpc="http://schemas.microsoft.com/office/word/2010/wordprocessingCanvas" xmlns:cx="http://schemas.microsoft.com/office/drawing/2014/chartex" xmlns:cx1="http://schemas.microsoft.com/office/drawing/2015/9/8/chartex" xmlns:cx2="http://schemas.microsoft.com/office/drawing/2015/10/21/chartex" xmlns:cx3="http://schemas.microsoft.com/office/drawing/2016/5/9/chartex" xmlns:cx4="http://schemas.microsoft.com/office/drawing/2016/5/10/chartex" xmlns:cx5="http://schemas.microsoft.com/office/drawing/2016/5/11/chartex" xmlns:cx6="http://schemas.microsoft.com/office/drawing/2016/5/12/chartex" xmlns:cx7="http://schemas.microsoft.com/office/drawing/2016/5/13/chartex" xmlns:cx8="http://schemas.microsoft.com/office/drawing/2016/5/14/chartex" xmlns:mc="http://schemas.openxmlformats.org/markup-compatibility/2006" xmlns:aink="http://schemas.microsoft.com/office/drawing/2016/ink" xmlns:am3d="http://schemas.microsoft.com/office/drawing/2017/model3d" xmlns:o="urn:schemas-microsoft-com:office:office" xmlns:oel="http://schemas.microsoft.com/office/2019/extlst" xmlns:r="http://schemas.openxmlformats.org/officeDocument/2006/relationships" xmlns:m="http://schemas.openxmlformats.org/officeDocument/2006/math" xmlns:v="urn:schemas-microsoft-com:vml" xmlns:wp14="http://schemas.microsoft.com/office/word/2010/wordprocessingDrawing" xmlns:wp="http://schemas.openxmlformats.org/drawingml/2006/wordprocessingDrawing" xmlns:w10="urn:schemas-microsoft-com:office:word" xmlns:w="http://schemas.openxmlformats.org/wordprocessingml/2006/main" xmlns:w14="http://schemas.microsoft.com/office/word/2010/wordml" xmlns:w15="http://schemas.microsoft.com/office/word/2012/wordml" xmlns:w16cex="http://schemas.microsoft.com/office/word/2018/wordml/cex" xmlns:w16cid="http://schemas.microsoft.com/office/word/2016/wordml/cid" xmlns:w16="http://schemas.microsoft.com/office/word/2018/wordml" xmlns:w16du="http://schemas.microsoft.com/office/word/2023/wordml/word16du" xmlns:w16sdtdh="http://schemas.microsoft.com/office/word/2020/wordml/sdtdatahash" xmlns:w16se="http://schemas.microsoft.com/office/word/2015/wordml/symex" xmlns:wpg="http://schemas.microsoft.com/office/word/2010/wordprocessingGroup" xmlns:wpi="http://schemas.microsoft.com/office/word/2010/wordprocessingInk" xmlns:wne="http://schemas.microsoft.com/office/word/2006/wordml" xmlns:wps="http://schemas.microsoft.com/office/word/2010/wordprocessingShape" mc:Ignorable="w14 w15 w16se w16cid w16 w16cex w16sdtdh wp14">
-  <w16cex:commentExtensible w16cex:durableId="27FC0095" w16cex:dateUtc="2023-05-02T20:35:00Z"/>
-  <w16cex:commentExtensible w16cex:durableId="27FED176" w16cex:dateUtc="2023-05-04T23:51:00Z"/>
-</w16cex:commentsExtensible>
-</file>
-
-<file path=word/commentsIds.xml><?xml version="1.0" encoding="utf-8"?>
-<w16cid:commentsIds xmlns:wpc="http://schemas.microsoft.com/office/word/2010/wordprocessingCanvas" xmlns:cx="http://schemas.microsoft.com/office/drawing/2014/chartex" xmlns:cx1="http://schemas.microsoft.com/office/drawing/2015/9/8/chartex" xmlns:cx2="http://schemas.microsoft.com/office/drawing/2015/10/21/chartex" xmlns:cx3="http://schemas.microsoft.com/office/drawing/2016/5/9/chartex" xmlns:cx4="http://schemas.microsoft.com/office/drawing/2016/5/10/chartex" xmlns:cx5="http://schemas.microsoft.com/office/drawing/2016/5/11/chartex" xmlns:cx6="http://schemas.microsoft.com/office/drawing/2016/5/12/chartex" xmlns:cx7="http://schemas.microsoft.com/office/drawing/2016/5/13/chartex" xmlns:cx8="http://schemas.microsoft.com/office/drawing/2016/5/14/chartex" xmlns:mc="http://schemas.openxmlformats.org/markup-compatibility/2006" xmlns:aink="http://schemas.microsoft.com/office/drawing/2016/ink" xmlns:am3d="http://schemas.microsoft.com/office/drawing/2017/model3d" xmlns:o="urn:schemas-microsoft-com:office:office" xmlns:oel="http://schemas.microsoft.com/office/2019/extlst" xmlns:r="http://schemas.openxmlformats.org/officeDocument/2006/relationships" xmlns:m="http://schemas.openxmlformats.org/officeDocument/2006/math" xmlns:v="urn:schemas-microsoft-com:vml" xmlns:wp14="http://schemas.microsoft.com/office/word/2010/wordprocessingDrawing" xmlns:wp="http://schemas.openxmlformats.org/drawingml/2006/wordprocessingDrawing" xmlns:w10="urn:schemas-microsoft-com:office:word" xmlns:w="http://schemas.openxmlformats.org/wordprocessingml/2006/main" xmlns:w14="http://schemas.microsoft.com/office/word/2010/wordml" xmlns:w15="http://schemas.microsoft.com/office/word/2012/wordml" xmlns:w16cex="http://schemas.microsoft.com/office/word/2018/wordml/cex" xmlns:w16cid="http://schemas.microsoft.com/office/word/2016/wordml/cid" xmlns:w16="http://schemas.microsoft.com/office/word/2018/wordml" xmlns:w16du="http://schemas.microsoft.com/office/word/2023/wordml/word16du" xmlns:w16sdtdh="http://schemas.microsoft.com/office/word/2020/wordml/sdtdatahash" xmlns:w16se="http://schemas.microsoft.com/office/word/2015/wordml/symex" xmlns:wpg="http://schemas.microsoft.com/office/word/2010/wordprocessingGroup" xmlns:wpi="http://schemas.microsoft.com/office/word/2010/wordprocessingInk" xmlns:wne="http://schemas.microsoft.com/office/word/2006/wordml" xmlns:wps="http://schemas.microsoft.com/office/word/2010/wordprocessingShape" mc:Ignorable="w14 w15 w16se w16cid w16 w16cex w16sdtdh wp14">
-  <w16cid:commentId w16cid:paraId="08A323CA" w16cid:durableId="27FC0095"/>
-  <w16cid:commentId w16cid:paraId="7FBC4797" w16cid:durableId="27FED176"/>
-</w16cid:commentsIds>
-</file>
-
 <file path=word/endnotes.xml><?xml version="1.0" encoding="utf-8"?>
-<w:endnotes xmlns:wpc="http://schemas.microsoft.com/office/word/2010/wordprocessingCanvas" xmlns:cx="http://schemas.microsoft.com/office/drawing/2014/chartex" xmlns:cx1="http://schemas.microsoft.com/office/drawing/2015/9/8/chartex" xmlns:cx2="http://schemas.microsoft.com/office/drawing/2015/10/21/chartex" xmlns:cx3="http://schemas.microsoft.com/office/drawing/2016/5/9/chartex" xmlns:cx4="http://schemas.microsoft.com/office/drawing/2016/5/10/chartex" xmlns:cx5="http://schemas.microsoft.com/office/drawing/2016/5/11/chartex" xmlns:cx6="http://schemas.microsoft.com/office/drawing/2016/5/12/chartex" xmlns:cx7="http://schemas.microsoft.com/office/drawing/2016/5/13/chartex" xmlns:cx8="http://schemas.microsoft.com/office/drawing/2016/5/14/chartex" xmlns:mc="http://schemas.openxmlformats.org/markup-compatibility/2006" xmlns:aink="http://schemas.microsoft.com/office/drawing/2016/ink" xmlns:am3d="http://schemas.microsoft.com/office/drawing/2017/model3d" xmlns:o="urn:schemas-microsoft-com:office:office" xmlns:oel="http://schemas.microsoft.com/office/2019/extlst" xmlns:r="http://schemas.openxmlformats.org/officeDocument/2006/relationships" xmlns:m="http://schemas.openxmlformats.org/officeDocument/2006/math" xmlns:v="urn:schemas-microsoft-com:vml" xmlns:wp14="http://schemas.microsoft.com/office/word/2010/wordprocessingDrawing" xmlns:wp="http://schemas.openxmlformats.org/drawingml/2006/wordprocessingDrawing" xmlns:w10="urn:schemas-microsoft-com:office:word" xmlns:w="http://schemas.openxmlformats.org/wordprocessingml/2006/main" xmlns:w14="http://schemas.microsoft.com/office/word/2010/wordml" xmlns:w15="http://schemas.microsoft.com/office/word/2012/wordml" xmlns:w16cex="http://schemas.microsoft.com/office/word/2018/wordml/cex" xmlns:w16cid="http://schemas.microsoft.com/office/word/2016/wordml/cid" xmlns:w16="http://schemas.microsoft.com/office/word/2018/wordml" xmlns:w16du="http://schemas.microsoft.com/office/word/2023/wordml/word16du" xmlns:w16sdtdh="http://schemas.microsoft.com/office/word/2020/wordml/sdtdatahash" xmlns:w16se="http://schemas.microsoft.com/office/word/2015/wordml/symex" xmlns:wpg="http://schemas.microsoft.com/office/word/2010/wordprocessingGroup" xmlns:wpi="http://schemas.microsoft.com/office/word/2010/wordprocessingInk" xmlns:wne="http://schemas.microsoft.com/office/word/2006/wordml" xmlns:wps="http://schemas.microsoft.com/office/word/2010/wordprocessingShape" mc:Ignorable="w14 w15 w16se w16cid w16 w16cex w16sdtdh wp14">
+<w:endnotes xmlns:wpc="http://schemas.microsoft.com/office/word/2010/wordprocessingCanvas" xmlns:cx="http://schemas.microsoft.com/office/drawing/2014/chartex" xmlns:cx1="http://schemas.microsoft.com/office/drawing/2015/9/8/chartex" xmlns:cx2="http://schemas.microsoft.com/office/drawing/2015/10/21/chartex" xmlns:cx3="http://schemas.microsoft.com/office/drawing/2016/5/9/chartex" xmlns:cx4="http://schemas.microsoft.com/office/drawing/2016/5/10/chartex" xmlns:cx5="http://schemas.microsoft.com/office/drawing/2016/5/11/chartex" xmlns:cx6="http://schemas.microsoft.com/office/drawing/2016/5/12/chartex" xmlns:cx7="http://schemas.microsoft.com/office/drawing/2016/5/13/chartex" xmlns:cx8="http://schemas.microsoft.com/office/drawing/2016/5/14/chartex" xmlns:mc="http://schemas.openxmlformats.org/markup-compatibility/2006" xmlns:aink="http://schemas.microsoft.com/office/drawing/2016/ink" xmlns:am3d="http://schemas.microsoft.com/office/drawing/2017/model3d" xmlns:o="urn:schemas-microsoft-com:office:office" xmlns:oel="http://schemas.microsoft.com/office/2019/extlst" xmlns:r="http://schemas.openxmlformats.org/officeDocument/2006/relationships" xmlns:m="http://schemas.openxmlformats.org/officeDocument/2006/math" xmlns:v="urn:schemas-microsoft-com:vml" xmlns:wp14="http://schemas.microsoft.com/office/word/2010/wordprocessingDrawing" xmlns:wp="http://schemas.openxmlformats.org/drawingml/2006/wordprocessingDrawing" xmlns:w10="urn:schemas-microsoft-com:office:word" xmlns:w="http://schemas.openxmlformats.org/wordprocessingml/2006/main" xmlns:w14="http://schemas.microsoft.com/office/word/2010/wordml" xmlns:w15="http://schemas.microsoft.com/office/word/2012/wordml" xmlns:w16cex="http://schemas.microsoft.com/office/word/2018/wordml/cex" xmlns:w16cid="http://schemas.microsoft.com/office/word/2016/wordml/cid" xmlns:w16="http://schemas.microsoft.com/office/word/2018/wordml" xmlns:w16sdtdh="http://schemas.microsoft.com/office/word/2020/wordml/sdtdatahash" xmlns:w16se="http://schemas.microsoft.com/office/word/2015/wordml/symex" xmlns:wpg="http://schemas.microsoft.com/office/word/2010/wordprocessingGroup" xmlns:wpi="http://schemas.microsoft.com/office/word/2010/wordprocessingInk" xmlns:wne="http://schemas.microsoft.com/office/word/2006/wordml" xmlns:wps="http://schemas.microsoft.com/office/word/2010/wordprocessingShape" mc:Ignorable="w14 w15 w16se w16cid w16 w16cex w16sdtdh wp14">
   <w:endnote w:type="separator" w:id="-1">
     <w:p>
       <w:pPr>
@@ -4190,7 +3944,7 @@
 </file>
 
 <file path=word/footnotes.xml><?xml version="1.0" encoding="utf-8"?>
-<w:footnotes xmlns:wpc="http://schemas.microsoft.com/office/word/2010/wordprocessingCanvas" xmlns:cx="http://schemas.microsoft.com/office/drawing/2014/chartex" xmlns:cx1="http://schemas.microsoft.com/office/drawing/2015/9/8/chartex" xmlns:cx2="http://schemas.microsoft.com/office/drawing/2015/10/21/chartex" xmlns:cx3="http://schemas.microsoft.com/office/drawing/2016/5/9/chartex" xmlns:cx4="http://schemas.microsoft.com/office/drawing/2016/5/10/chartex" xmlns:cx5="http://schemas.microsoft.com/office/drawing/2016/5/11/chartex" xmlns:cx6="http://schemas.microsoft.com/office/drawing/2016/5/12/chartex" xmlns:cx7="http://schemas.microsoft.com/office/drawing/2016/5/13/chartex" xmlns:cx8="http://schemas.microsoft.com/office/drawing/2016/5/14/chartex" xmlns:mc="http://schemas.openxmlformats.org/markup-compatibility/2006" xmlns:aink="http://schemas.microsoft.com/office/drawing/2016/ink" xmlns:am3d="http://schemas.microsoft.com/office/drawing/2017/model3d" xmlns:o="urn:schemas-microsoft-com:office:office" xmlns:oel="http://schemas.microsoft.com/office/2019/extlst" xmlns:r="http://schemas.openxmlformats.org/officeDocument/2006/relationships" xmlns:m="http://schemas.openxmlformats.org/officeDocument/2006/math" xmlns:v="urn:schemas-microsoft-com:vml" xmlns:wp14="http://schemas.microsoft.com/office/word/2010/wordprocessingDrawing" xmlns:wp="http://schemas.openxmlformats.org/drawingml/2006/wordprocessingDrawing" xmlns:w10="urn:schemas-microsoft-com:office:word" xmlns:w="http://schemas.openxmlformats.org/wordprocessingml/2006/main" xmlns:w14="http://schemas.microsoft.com/office/word/2010/wordml" xmlns:w15="http://schemas.microsoft.com/office/word/2012/wordml" xmlns:w16cex="http://schemas.microsoft.com/office/word/2018/wordml/cex" xmlns:w16cid="http://schemas.microsoft.com/office/word/2016/wordml/cid" xmlns:w16="http://schemas.microsoft.com/office/word/2018/wordml" xmlns:w16du="http://schemas.microsoft.com/office/word/2023/wordml/word16du" xmlns:w16sdtdh="http://schemas.microsoft.com/office/word/2020/wordml/sdtdatahash" xmlns:w16se="http://schemas.microsoft.com/office/word/2015/wordml/symex" xmlns:wpg="http://schemas.microsoft.com/office/word/2010/wordprocessingGroup" xmlns:wpi="http://schemas.microsoft.com/office/word/2010/wordprocessingInk" xmlns:wne="http://schemas.microsoft.com/office/word/2006/wordml" xmlns:wps="http://schemas.microsoft.com/office/word/2010/wordprocessingShape" mc:Ignorable="w14 w15 w16se w16cid w16 w16cex w16sdtdh wp14">
+<w:footnotes xmlns:wpc="http://schemas.microsoft.com/office/word/2010/wordprocessingCanvas" xmlns:cx="http://schemas.microsoft.com/office/drawing/2014/chartex" xmlns:cx1="http://schemas.microsoft.com/office/drawing/2015/9/8/chartex" xmlns:cx2="http://schemas.microsoft.com/office/drawing/2015/10/21/chartex" xmlns:cx3="http://schemas.microsoft.com/office/drawing/2016/5/9/chartex" xmlns:cx4="http://schemas.microsoft.com/office/drawing/2016/5/10/chartex" xmlns:cx5="http://schemas.microsoft.com/office/drawing/2016/5/11/chartex" xmlns:cx6="http://schemas.microsoft.com/office/drawing/2016/5/12/chartex" xmlns:cx7="http://schemas.microsoft.com/office/drawing/2016/5/13/chartex" xmlns:cx8="http://schemas.microsoft.com/office/drawing/2016/5/14/chartex" xmlns:mc="http://schemas.openxmlformats.org/markup-compatibility/2006" xmlns:aink="http://schemas.microsoft.com/office/drawing/2016/ink" xmlns:am3d="http://schemas.microsoft.com/office/drawing/2017/model3d" xmlns:o="urn:schemas-microsoft-com:office:office" xmlns:oel="http://schemas.microsoft.com/office/2019/extlst" xmlns:r="http://schemas.openxmlformats.org/officeDocument/2006/relationships" xmlns:m="http://schemas.openxmlformats.org/officeDocument/2006/math" xmlns:v="urn:schemas-microsoft-com:vml" xmlns:wp14="http://schemas.microsoft.com/office/word/2010/wordprocessingDrawing" xmlns:wp="http://schemas.openxmlformats.org/drawingml/2006/wordprocessingDrawing" xmlns:w10="urn:schemas-microsoft-com:office:word" xmlns:w="http://schemas.openxmlformats.org/wordprocessingml/2006/main" xmlns:w14="http://schemas.microsoft.com/office/word/2010/wordml" xmlns:w15="http://schemas.microsoft.com/office/word/2012/wordml" xmlns:w16cex="http://schemas.microsoft.com/office/word/2018/wordml/cex" xmlns:w16cid="http://schemas.microsoft.com/office/word/2016/wordml/cid" xmlns:w16="http://schemas.microsoft.com/office/word/2018/wordml" xmlns:w16sdtdh="http://schemas.microsoft.com/office/word/2020/wordml/sdtdatahash" xmlns:w16se="http://schemas.microsoft.com/office/word/2015/wordml/symex" xmlns:wpg="http://schemas.microsoft.com/office/word/2010/wordprocessingGroup" xmlns:wpi="http://schemas.microsoft.com/office/word/2010/wordprocessingInk" xmlns:wne="http://schemas.microsoft.com/office/word/2006/wordml" xmlns:wps="http://schemas.microsoft.com/office/word/2010/wordprocessingShape" mc:Ignorable="w14 w15 w16se w16cid w16 w16cex w16sdtdh wp14">
   <w:footnote w:type="separator" w:id="-1">
     <w:p>
       <w:pPr>
@@ -4215,7 +3969,7 @@
 </file>
 
 <file path=word/header1.xml><?xml version="1.0" encoding="utf-8"?>
-<w:hdr xmlns:wpc="http://schemas.microsoft.com/office/word/2010/wordprocessingCanvas" xmlns:cx="http://schemas.microsoft.com/office/drawing/2014/chartex" xmlns:cx1="http://schemas.microsoft.com/office/drawing/2015/9/8/chartex" xmlns:cx2="http://schemas.microsoft.com/office/drawing/2015/10/21/chartex" xmlns:cx3="http://schemas.microsoft.com/office/drawing/2016/5/9/chartex" xmlns:cx4="http://schemas.microsoft.com/office/drawing/2016/5/10/chartex" xmlns:cx5="http://schemas.microsoft.com/office/drawing/2016/5/11/chartex" xmlns:cx6="http://schemas.microsoft.com/office/drawing/2016/5/12/chartex" xmlns:cx7="http://schemas.microsoft.com/office/drawing/2016/5/13/chartex" xmlns:cx8="http://schemas.microsoft.com/office/drawing/2016/5/14/chartex" xmlns:mc="http://schemas.openxmlformats.org/markup-compatibility/2006" xmlns:aink="http://schemas.microsoft.com/office/drawing/2016/ink" xmlns:am3d="http://schemas.microsoft.com/office/drawing/2017/model3d" xmlns:o="urn:schemas-microsoft-com:office:office" xmlns:oel="http://schemas.microsoft.com/office/2019/extlst" xmlns:r="http://schemas.openxmlformats.org/officeDocument/2006/relationships" xmlns:m="http://schemas.openxmlformats.org/officeDocument/2006/math" xmlns:v="urn:schemas-microsoft-com:vml" xmlns:wp14="http://schemas.microsoft.com/office/word/2010/wordprocessingDrawing" xmlns:wp="http://schemas.openxmlformats.org/drawingml/2006/wordprocessingDrawing" xmlns:w10="urn:schemas-microsoft-com:office:word" xmlns:w="http://schemas.openxmlformats.org/wordprocessingml/2006/main" xmlns:w14="http://schemas.microsoft.com/office/word/2010/wordml" xmlns:w15="http://schemas.microsoft.com/office/word/2012/wordml" xmlns:w16cex="http://schemas.microsoft.com/office/word/2018/wordml/cex" xmlns:w16cid="http://schemas.microsoft.com/office/word/2016/wordml/cid" xmlns:w16="http://schemas.microsoft.com/office/word/2018/wordml" xmlns:w16du="http://schemas.microsoft.com/office/word/2023/wordml/word16du" xmlns:w16sdtdh="http://schemas.microsoft.com/office/word/2020/wordml/sdtdatahash" xmlns:w16se="http://schemas.microsoft.com/office/word/2015/wordml/symex" xmlns:wpg="http://schemas.microsoft.com/office/word/2010/wordprocessingGroup" xmlns:wpi="http://schemas.microsoft.com/office/word/2010/wordprocessingInk" xmlns:wne="http://schemas.microsoft.com/office/word/2006/wordml" xmlns:wps="http://schemas.microsoft.com/office/word/2010/wordprocessingShape" mc:Ignorable="w14 w15 w16se w16cid w16 w16cex w16sdtdh wp14">
+<w:hdr xmlns:wpc="http://schemas.microsoft.com/office/word/2010/wordprocessingCanvas" xmlns:cx="http://schemas.microsoft.com/office/drawing/2014/chartex" xmlns:cx1="http://schemas.microsoft.com/office/drawing/2015/9/8/chartex" xmlns:cx2="http://schemas.microsoft.com/office/drawing/2015/10/21/chartex" xmlns:cx3="http://schemas.microsoft.com/office/drawing/2016/5/9/chartex" xmlns:cx4="http://schemas.microsoft.com/office/drawing/2016/5/10/chartex" xmlns:cx5="http://schemas.microsoft.com/office/drawing/2016/5/11/chartex" xmlns:cx6="http://schemas.microsoft.com/office/drawing/2016/5/12/chartex" xmlns:cx7="http://schemas.microsoft.com/office/drawing/2016/5/13/chartex" xmlns:cx8="http://schemas.microsoft.com/office/drawing/2016/5/14/chartex" xmlns:mc="http://schemas.openxmlformats.org/markup-compatibility/2006" xmlns:aink="http://schemas.microsoft.com/office/drawing/2016/ink" xmlns:am3d="http://schemas.microsoft.com/office/drawing/2017/model3d" xmlns:o="urn:schemas-microsoft-com:office:office" xmlns:oel="http://schemas.microsoft.com/office/2019/extlst" xmlns:r="http://schemas.openxmlformats.org/officeDocument/2006/relationships" xmlns:m="http://schemas.openxmlformats.org/officeDocument/2006/math" xmlns:v="urn:schemas-microsoft-com:vml" xmlns:wp14="http://schemas.microsoft.com/office/word/2010/wordprocessingDrawing" xmlns:wp="http://schemas.openxmlformats.org/drawingml/2006/wordprocessingDrawing" xmlns:w10="urn:schemas-microsoft-com:office:word" xmlns:w="http://schemas.openxmlformats.org/wordprocessingml/2006/main" xmlns:w14="http://schemas.microsoft.com/office/word/2010/wordml" xmlns:w15="http://schemas.microsoft.com/office/word/2012/wordml" xmlns:w16cex="http://schemas.microsoft.com/office/word/2018/wordml/cex" xmlns:w16cid="http://schemas.microsoft.com/office/word/2016/wordml/cid" xmlns:w16="http://schemas.microsoft.com/office/word/2018/wordml" xmlns:w16sdtdh="http://schemas.microsoft.com/office/word/2020/wordml/sdtdatahash" xmlns:w16se="http://schemas.microsoft.com/office/word/2015/wordml/symex" xmlns:wpg="http://schemas.microsoft.com/office/word/2010/wordprocessingGroup" xmlns:wpi="http://schemas.microsoft.com/office/word/2010/wordprocessingInk" xmlns:wne="http://schemas.microsoft.com/office/word/2006/wordml" xmlns:wps="http://schemas.microsoft.com/office/word/2010/wordprocessingShape" mc:Ignorable="w14 w15 w16se w16cid w16 w16cex w16sdtdh wp14">
   <w:p>
     <w:pPr>
       <w:pStyle w:val="Header"/>
@@ -4236,7 +3990,7 @@
 </file>
 
 <file path=word/numbering.xml><?xml version="1.0" encoding="utf-8"?>
-<w:numbering xmlns:wpc="http://schemas.microsoft.com/office/word/2010/wordprocessingCanvas" xmlns:cx="http://schemas.microsoft.com/office/drawing/2014/chartex" xmlns:cx1="http://schemas.microsoft.com/office/drawing/2015/9/8/chartex" xmlns:cx2="http://schemas.microsoft.com/office/drawing/2015/10/21/chartex" xmlns:cx3="http://schemas.microsoft.com/office/drawing/2016/5/9/chartex" xmlns:cx4="http://schemas.microsoft.com/office/drawing/2016/5/10/chartex" xmlns:cx5="http://schemas.microsoft.com/office/drawing/2016/5/11/chartex" xmlns:cx6="http://schemas.microsoft.com/office/drawing/2016/5/12/chartex" xmlns:cx7="http://schemas.microsoft.com/office/drawing/2016/5/13/chartex" xmlns:cx8="http://schemas.microsoft.com/office/drawing/2016/5/14/chartex" xmlns:mc="http://schemas.openxmlformats.org/markup-compatibility/2006" xmlns:aink="http://schemas.microsoft.com/office/drawing/2016/ink" xmlns:am3d="http://schemas.microsoft.com/office/drawing/2017/model3d" xmlns:o="urn:schemas-microsoft-com:office:office" xmlns:oel="http://schemas.microsoft.com/office/2019/extlst" xmlns:r="http://schemas.openxmlformats.org/officeDocument/2006/relationships" xmlns:m="http://schemas.openxmlformats.org/officeDocument/2006/math" xmlns:v="urn:schemas-microsoft-com:vml" xmlns:wp14="http://schemas.microsoft.com/office/word/2010/wordprocessingDrawing" xmlns:wp="http://schemas.openxmlformats.org/drawingml/2006/wordprocessingDrawing" xmlns:w10="urn:schemas-microsoft-com:office:word" xmlns:w="http://schemas.openxmlformats.org/wordprocessingml/2006/main" xmlns:w14="http://schemas.microsoft.com/office/word/2010/wordml" xmlns:w15="http://schemas.microsoft.com/office/word/2012/wordml" xmlns:w16cex="http://schemas.microsoft.com/office/word/2018/wordml/cex" xmlns:w16cid="http://schemas.microsoft.com/office/word/2016/wordml/cid" xmlns:w16="http://schemas.microsoft.com/office/word/2018/wordml" xmlns:w16du="http://schemas.microsoft.com/office/word/2023/wordml/word16du" xmlns:w16sdtdh="http://schemas.microsoft.com/office/word/2020/wordml/sdtdatahash" xmlns:w16se="http://schemas.microsoft.com/office/word/2015/wordml/symex" xmlns:wpg="http://schemas.microsoft.com/office/word/2010/wordprocessingGroup" xmlns:wpi="http://schemas.microsoft.com/office/word/2010/wordprocessingInk" xmlns:wne="http://schemas.microsoft.com/office/word/2006/wordml" xmlns:wps="http://schemas.microsoft.com/office/word/2010/wordprocessingShape" mc:Ignorable="w14 w15 w16se w16cid w16 w16cex w16sdtdh wp14">
+<w:numbering xmlns:wpc="http://schemas.microsoft.com/office/word/2010/wordprocessingCanvas" xmlns:cx="http://schemas.microsoft.com/office/drawing/2014/chartex" xmlns:cx1="http://schemas.microsoft.com/office/drawing/2015/9/8/chartex" xmlns:cx2="http://schemas.microsoft.com/office/drawing/2015/10/21/chartex" xmlns:cx3="http://schemas.microsoft.com/office/drawing/2016/5/9/chartex" xmlns:cx4="http://schemas.microsoft.com/office/drawing/2016/5/10/chartex" xmlns:cx5="http://schemas.microsoft.com/office/drawing/2016/5/11/chartex" xmlns:cx6="http://schemas.microsoft.com/office/drawing/2016/5/12/chartex" xmlns:cx7="http://schemas.microsoft.com/office/drawing/2016/5/13/chartex" xmlns:cx8="http://schemas.microsoft.com/office/drawing/2016/5/14/chartex" xmlns:mc="http://schemas.openxmlformats.org/markup-compatibility/2006" xmlns:aink="http://schemas.microsoft.com/office/drawing/2016/ink" xmlns:am3d="http://schemas.microsoft.com/office/drawing/2017/model3d" xmlns:o="urn:schemas-microsoft-com:office:office" xmlns:oel="http://schemas.microsoft.com/office/2019/extlst" xmlns:r="http://schemas.openxmlformats.org/officeDocument/2006/relationships" xmlns:m="http://schemas.openxmlformats.org/officeDocument/2006/math" xmlns:v="urn:schemas-microsoft-com:vml" xmlns:wp14="http://schemas.microsoft.com/office/word/2010/wordprocessingDrawing" xmlns:wp="http://schemas.openxmlformats.org/drawingml/2006/wordprocessingDrawing" xmlns:w10="urn:schemas-microsoft-com:office:word" xmlns:w="http://schemas.openxmlformats.org/wordprocessingml/2006/main" xmlns:w14="http://schemas.microsoft.com/office/word/2010/wordml" xmlns:w15="http://schemas.microsoft.com/office/word/2012/wordml" xmlns:w16cex="http://schemas.microsoft.com/office/word/2018/wordml/cex" xmlns:w16cid="http://schemas.microsoft.com/office/word/2016/wordml/cid" xmlns:w16="http://schemas.microsoft.com/office/word/2018/wordml" xmlns:w16sdtdh="http://schemas.microsoft.com/office/word/2020/wordml/sdtdatahash" xmlns:w16se="http://schemas.microsoft.com/office/word/2015/wordml/symex" xmlns:wpg="http://schemas.microsoft.com/office/word/2010/wordprocessingGroup" xmlns:wpi="http://schemas.microsoft.com/office/word/2010/wordprocessingInk" xmlns:wne="http://schemas.microsoft.com/office/word/2006/wordml" xmlns:wps="http://schemas.microsoft.com/office/word/2010/wordprocessingShape" mc:Ignorable="w14 w15 w16se w16cid w16 w16cex w16sdtdh wp14">
   <w:abstractNum w:abstractNumId="0" w15:restartNumberingAfterBreak="0">
     <w:nsid w:val="11092817"/>
     <w:multiLevelType w:val="hybridMultilevel"/>
@@ -4877,14 +4631,6 @@
     <w:abstractNumId w:val="5"/>
   </w:num>
 </w:numbering>
-</file>
-
-<file path=word/people.xml><?xml version="1.0" encoding="utf-8"?>
-<w15:people xmlns:wpc="http://schemas.microsoft.com/office/word/2010/wordprocessingCanvas" xmlns:cx="http://schemas.microsoft.com/office/drawing/2014/chartex" xmlns:cx1="http://schemas.microsoft.com/office/drawing/2015/9/8/chartex" xmlns:cx2="http://schemas.microsoft.com/office/drawing/2015/10/21/chartex" xmlns:cx3="http://schemas.microsoft.com/office/drawing/2016/5/9/chartex" xmlns:cx4="http://schemas.microsoft.com/office/drawing/2016/5/10/chartex" xmlns:cx5="http://schemas.microsoft.com/office/drawing/2016/5/11/chartex" xmlns:cx6="http://schemas.microsoft.com/office/drawing/2016/5/12/chartex" xmlns:cx7="http://schemas.microsoft.com/office/drawing/2016/5/13/chartex" xmlns:cx8="http://schemas.microsoft.com/office/drawing/2016/5/14/chartex" xmlns:mc="http://schemas.openxmlformats.org/markup-compatibility/2006" xmlns:aink="http://schemas.microsoft.com/office/drawing/2016/ink" xmlns:am3d="http://schemas.microsoft.com/office/drawing/2017/model3d" xmlns:o="urn:schemas-microsoft-com:office:office" xmlns:oel="http://schemas.microsoft.com/office/2019/extlst" xmlns:r="http://schemas.openxmlformats.org/officeDocument/2006/relationships" xmlns:m="http://schemas.openxmlformats.org/officeDocument/2006/math" xmlns:v="urn:schemas-microsoft-com:vml" xmlns:wp14="http://schemas.microsoft.com/office/word/2010/wordprocessingDrawing" xmlns:wp="http://schemas.openxmlformats.org/drawingml/2006/wordprocessingDrawing" xmlns:w10="urn:schemas-microsoft-com:office:word" xmlns:w="http://schemas.openxmlformats.org/wordprocessingml/2006/main" xmlns:w14="http://schemas.microsoft.com/office/word/2010/wordml" xmlns:w15="http://schemas.microsoft.com/office/word/2012/wordml" xmlns:w16cex="http://schemas.microsoft.com/office/word/2018/wordml/cex" xmlns:w16cid="http://schemas.microsoft.com/office/word/2016/wordml/cid" xmlns:w16="http://schemas.microsoft.com/office/word/2018/wordml" xmlns:w16du="http://schemas.microsoft.com/office/word/2023/wordml/word16du" xmlns:w16sdtdh="http://schemas.microsoft.com/office/word/2020/wordml/sdtdatahash" xmlns:w16se="http://schemas.microsoft.com/office/word/2015/wordml/symex" xmlns:wpg="http://schemas.microsoft.com/office/word/2010/wordprocessingGroup" xmlns:wpi="http://schemas.microsoft.com/office/word/2010/wordprocessingInk" xmlns:wne="http://schemas.microsoft.com/office/word/2006/wordml" xmlns:wps="http://schemas.microsoft.com/office/word/2010/wordprocessingShape" mc:Ignorable="w14 w15 w16se w16cid w16 w16cex w16sdtdh wp14">
-  <w15:person w15:author="Interior">
-    <w15:presenceInfo w15:providerId="Windows Live" w15:userId="bbc49117f81d67ee"/>
-  </w15:person>
-</w15:people>
 </file>
 
 <file path=word/styles.xml><?xml version="1.0" encoding="utf-8"?>

</xml_diff>